<commit_message>
Print to a USB receipt printer on Windows, Windows setup guide, chapter 4 with 134 tests
Co-Authored-By: Claude Opus 5.5 <noreply@anthropic.com>
</commit_message>
<xml_diff>
--- a/เอกสารแต่ละบท/บทที่4.docx
+++ b/เอกสารแต่ละบท/บทที่4.docx
@@ -2658,6 +2658,98 @@
               <w:pStyle w:val="Compact"/>
             </w:pPr>
             <w:r>
+              <w:t xml:space="preserve">หน่วย</w:t>
+            </w:r>
+          </w:p>
+        </w:tc>
+        <w:tc>
+          <w:tcPr>
+            <w:tcW w:w="2629" w:type="dxa"/>
+          </w:tcPr>
+          <w:tcPr/>
+          <w:p>
+            <w:pPr>
+              <w:pStyle w:val="Compact"/>
+            </w:pPr>
+            <w:r>
+              <w:rPr>
+                <w:rStyle w:val="VerbatimChar"/>
+              </w:rPr>
+              <w:t xml:space="preserve">transport.test.js</w:t>
+            </w:r>
+          </w:p>
+        </w:tc>
+        <w:tc>
+          <w:tcPr>
+            <w:tcW w:w="2371" w:type="dxa"/>
+          </w:tcPr>
+          <w:tcPr/>
+          <w:p>
+            <w:pPr>
+              <w:pStyle w:val="Compact"/>
+            </w:pPr>
+            <w:r>
+              <w:t xml:space="preserve">คำสั่งส่งงานเข้าคิวพิมพ์ของเครื่องพิมพ์ USB บน Mac Linux และ Windows</w:t>
+            </w:r>
+          </w:p>
+        </w:tc>
+        <w:tc>
+          <w:tcPr>
+            <w:tcW w:w="775" w:type="dxa"/>
+          </w:tcPr>
+          <w:tcPr/>
+          <w:p>
+            <w:pPr>
+              <w:pStyle w:val="Compact"/>
+              <w:jc w:val="center"/>
+            </w:pPr>
+            <w:r>
+              <w:t xml:space="preserve">3</w:t>
+            </w:r>
+          </w:p>
+        </w:tc>
+        <w:tc>
+          <w:tcPr>
+            <w:tcW w:w="569" w:type="dxa"/>
+          </w:tcPr>
+          <w:tcPr/>
+          <w:p>
+            <w:pPr>
+              <w:pStyle w:val="Compact"/>
+              <w:jc w:val="center"/>
+            </w:pPr>
+            <w:r>
+              <w:t xml:space="preserve">3</w:t>
+            </w:r>
+          </w:p>
+        </w:tc>
+        <w:tc>
+          <w:tcPr>
+            <w:tcW w:w="775" w:type="dxa"/>
+          </w:tcPr>
+          <w:tcPr/>
+          <w:p>
+            <w:pPr>
+              <w:pStyle w:val="Compact"/>
+              <w:jc w:val="center"/>
+            </w:pPr>
+            <w:r>
+              <w:t xml:space="preserve">0</w:t>
+            </w:r>
+          </w:p>
+        </w:tc>
+      </w:tr>
+      <w:tr>
+        <w:tc>
+          <w:tcPr>
+            <w:tcW w:w="1187" w:type="dxa"/>
+          </w:tcPr>
+          <w:tcPr/>
+          <w:p>
+            <w:pPr>
+              <w:pStyle w:val="Compact"/>
+            </w:pPr>
+            <w:r>
               <w:t xml:space="preserve">การรวมส่วน</w:t>
             </w:r>
           </w:p>
@@ -3508,7 +3600,7 @@
                 <w:b/>
                 <w:bCs/>
               </w:rPr>
-              <w:t xml:space="preserve">13 ชุด</w:t>
+              <w:t xml:space="preserve">14 ชุด</w:t>
             </w:r>
           </w:p>
         </w:tc>
@@ -3538,7 +3630,7 @@
                 <w:b/>
                 <w:bCs/>
               </w:rPr>
-              <w:t xml:space="preserve">131</w:t>
+              <w:t xml:space="preserve">134</w:t>
             </w:r>
           </w:p>
         </w:tc>
@@ -3557,7 +3649,7 @@
                 <w:b/>
                 <w:bCs/>
               </w:rPr>
-              <w:t xml:space="preserve">131</w:t>
+              <w:t xml:space="preserve">134</w:t>
             </w:r>
           </w:p>
         </w:tc>
@@ -3587,7 +3679,7 @@
         <w:pStyle w:val="BodyText"/>
       </w:pPr>
       <w:r>
-        <w:t xml:space="preserve">จากตารางที่ 4.3 การทดสอบทั้ง 131 ข้อผ่านทั้งหมด ใช้เวลารวม 4.1 วินาที ความครอบคลุมของโค้ดโดยรวมอยู่ที่ร้อยละ 88.54 ของคำสั่ง โดยโมดูลบริการตัดสต็อกซึ่งเป็นส่วนที่สำคัญที่สุดของระบบมีความครอบคลุมร้อยละ 100 ทั้งคำสั่ง เงื่อนไข และฟังก์ชัน ส่วนที่ความครอบคลุมต่ำกว่าส่วนอื่นคือโมดูลส่งข้อมูลไปยังเครื่องพิมพ์ เนื่องจากต้องเรียกใช้คิวพิมพ์ของระบบปฏิบัติการซึ่งทดสอบอัตโนมัติไม่ได้ จึงทวนสอบด้วยการพิมพ์จริงแทน ตามกรณีทดสอบ TC-13</w:t>
+        <w:t xml:space="preserve">จากตารางที่ 4.3 การทดสอบทั้ง 134 ข้อผ่านทั้งหมด ใช้เวลารวม 4.2 วินาที ความครอบคลุมของโค้ดโดยรวมอยู่ที่ร้อยละ 89.93 ของคำสั่ง โดยโมดูลบริการตัดสต็อกซึ่งเป็นส่วนที่สำคัญที่สุดของระบบมีความครอบคลุมร้อยละ 100 ทั้งคำสั่ง เงื่อนไข และฟังก์ชัน ส่วนที่ความครอบคลุมต่ำกว่าส่วนอื่นคือโมดูลส่งข้อมูลไปยังเครื่องพิมพ์ เนื่องจากต้องเรียกใช้คิวพิมพ์ของระบบปฏิบัติการซึ่งทดสอบอัตโนมัติไม่ได้ จึงทวนสอบด้วยการพิมพ์จริงแทน ตามกรณีทดสอบ TC-13</w:t>
       </w:r>
     </w:p>
     <w:bookmarkEnd w:id="58"/>

</xml_diff>